<commit_message>
Update Polycom VoIP.ms checklist authentication
</commit_message>
<xml_diff>
--- a/downloads/polycom-voipms-next-phone-checklist.docx
+++ b/downloads/polycom-voipms-next-phone-checklist.docx
@@ -594,7 +594,7 @@
         <w:t xml:space="preserve">[ ] </w:t>
       </w:r>
       <w:r>
-        <w:t>If the phone offers Use Login Credentials, enable/check it.</w:t>
+        <w:t>Leave Use Login Credentials / separate phone authentication disabled from the start.</w:t>
       </w:r>
     </w:p>
     <w:p>
@@ -622,7 +622,7 @@
         <w:t xml:space="preserve">[ ] </w:t>
       </w:r>
       <w:r>
-        <w:t>Set Authentication User ID and Password to the VoIP.ms subaccount credentials.</w:t>
+        <w:t>Leave separate Authentication User ID / Authentication Password fields blank or disabled unless later troubleshooting proves they are needed.</w:t>
       </w:r>
     </w:p>
     <w:p>
@@ -1131,6 +1131,17 @@
         <w:t>Version: 2026-06-26. Built from Alan's working Polycom VVX 310 / VoIP.ms setup notes.</w:t>
       </w:r>
     </w:p>
+    <w:p>
+      <w:r>
+        <w:rPr>
+          <w:b/>
+        </w:rPr>
+        <w:t xml:space="preserve">Checklist correction: </w:t>
+      </w:r>
+      <w:r>
+        <w:t>Alan's second phone registered only after the separate Polycom authentication path was disabled. For the next phone, do not enable Use Login Credentials by default.</w:t>
+      </w:r>
+    </w:p>
     <w:sectPr>
       <w:pgSz w:w="12240" w:h="15840"/>
       <w:pgMar w:top="792" w:right="936" w:bottom="792" w:left="936" w:header="720" w:footer="720" w:gutter="0"/>

</xml_diff>